<commit_message>
Review and Update Pre-Post-installer and add backup / restore for ZIP-Plugin-Files install
</commit_message>
<xml_diff>
--- a/Simple-Lightbox-fslight-PHP-technische-Dokumentation.docx
+++ b/Simple-Lightbox-fslight-PHP-technische-Dokumentation.docx
@@ -35,13 +35,8 @@
     </w:p>
     <w:p>
       <w:r>
-        <w:t>Analysierte PHP-</w:t>
+        <w:t>Analysierte PHP-Dateien</w:t>
       </w:r>
-      <w:proofErr w:type="spellStart"/>
-      <w:r>
-        <w:t>Dateien</w:t>
-      </w:r>
-      <w:proofErr w:type="spellEnd"/>
       <w:r>
         <w:t>:</w:t>
       </w:r>
@@ -55,15 +50,7 @@
         </w:numPr>
       </w:pPr>
       <w:r>
-        <w:t>simple-lightbox-</w:t>
-      </w:r>
-      <w:proofErr w:type="spellStart"/>
-      <w:r>
-        <w:t>fslight.php</w:t>
-      </w:r>
-      <w:proofErr w:type="spellEnd"/>
-      <w:r>
-        <w:t xml:space="preserve">, </w:t>
+        <w:t xml:space="preserve">simple-lightbox-fslight.php, </w:t>
       </w:r>
     </w:p>
     <w:p>
@@ -75,15 +62,7 @@
         </w:numPr>
       </w:pPr>
       <w:r>
-        <w:t>classes/</w:t>
-      </w:r>
-      <w:proofErr w:type="spellStart"/>
-      <w:r>
-        <w:t>RewriteFigureTagsClass.php</w:t>
-      </w:r>
-      <w:proofErr w:type="spellEnd"/>
-      <w:r>
-        <w:t xml:space="preserve">, </w:t>
+        <w:t xml:space="preserve">classes/RewriteFigureTagsClass.php, </w:t>
       </w:r>
     </w:p>
     <w:p>
@@ -95,15 +74,7 @@
         </w:numPr>
       </w:pPr>
       <w:r>
-        <w:t>classes/</w:t>
-      </w:r>
-      <w:proofErr w:type="spellStart"/>
-      <w:r>
-        <w:t>hrefImageDetection.php</w:t>
-      </w:r>
-      <w:proofErr w:type="spellEnd"/>
-      <w:r>
-        <w:t xml:space="preserve"> und </w:t>
+        <w:t xml:space="preserve">classes/hrefImageDetection.php und </w:t>
       </w:r>
     </w:p>
     <w:p>
@@ -115,20 +86,13 @@
         </w:numPr>
       </w:pPr>
       <w:r>
-        <w:t>admin/pre-post-</w:t>
+        <w:t>admin/pre-post-install.php</w:t>
       </w:r>
-      <w:proofErr w:type="spellStart"/>
-      <w:r>
-        <w:t>install.php</w:t>
-      </w:r>
-      <w:proofErr w:type="spellEnd"/>
     </w:p>
     <w:p>
-      <w:proofErr w:type="spellStart"/>
       <w:r>
         <w:t>Quellstand</w:t>
       </w:r>
-      <w:proofErr w:type="spellEnd"/>
       <w:r>
         <w:br/>
         <w:t>Plugin-Version 3.3.0 · 1.580 PHP-Zeilen · Dokumentationsstand 27.07.2026</w:t>
@@ -2362,23 +2326,7 @@
     </w:tbl>
     <w:p>
       <w:r>
-        <w:t xml:space="preserve">Im JavaScript-Modus wird SLFS_CONFIG vor dem Renderer eingefügt. Es enthält settingsUrl, galleryKey, den Paid-/Basic-Status, </w:t>
-      </w:r>
-      <w:proofErr w:type="spellStart"/>
-      <w:r>
-        <w:t>scanBody</w:t>
-      </w:r>
-      <w:proofErr w:type="spellEnd"/>
-      <w:r>
-        <w:t xml:space="preserve">=true und </w:t>
-      </w:r>
-      <w:proofErr w:type="spellStart"/>
-      <w:r>
-        <w:t>cssClassesToSearch</w:t>
-      </w:r>
-      <w:proofErr w:type="spellEnd"/>
-      <w:r>
-        <w:t xml:space="preserve">. </w:t>
+        <w:t xml:space="preserve">Im JavaScript-Modus wird SLFS_CONFIG vor dem Renderer eingefügt. Es enthält settingsUrl, galleryKey, den Paid-/Basic-Status, scanBody=true und cssClassesToSearch. </w:t>
       </w:r>
       <w:del w:id="0" w:author="Martin von Berg" w:date="2026-07-29T10:51:00Z" w16du:dateUtc="2026-07-29T08:51:00Z">
         <w:r>
@@ -2822,9 +2770,11 @@
             <w:tcW w:w="3264" w:type="dxa"/>
           </w:tcPr>
           <w:p>
-            <w:r>
-              <w:t>DOM-Parsing</w:t>
-            </w:r>
+            <w:del w:id="1" w:author="Martin von Berg" w:date="2026-07-30T17:18:00Z" w16du:dateUtc="2026-07-30T15:18:00Z">
+              <w:r>
+                <w:delText>DOM-Parsing</w:delText>
+              </w:r>
+            </w:del>
           </w:p>
         </w:tc>
         <w:tc>
@@ -2832,9 +2782,11 @@
             <w:tcW w:w="3264" w:type="dxa"/>
           </w:tcPr>
           <w:p>
-            <w:r>
-              <w:t>libxml_use_internal_errors(true) und Fehlerflags</w:t>
-            </w:r>
+            <w:del w:id="2" w:author="Martin von Berg" w:date="2026-07-30T17:18:00Z" w16du:dateUtc="2026-07-30T15:18:00Z">
+              <w:r>
+                <w:delText>libxml_use_internal_errors(true) und Fehlerflags</w:delText>
+              </w:r>
+            </w:del>
           </w:p>
         </w:tc>
         <w:tc>
@@ -2847,12 +2799,14 @@
                 <w:highlight w:val="yellow"/>
               </w:rPr>
             </w:pPr>
-            <w:r>
-              <w:rPr>
-                <w:highlight w:val="yellow"/>
-              </w:rPr>
-              <w:t>Gesammelte libxml-Fehler werden nicht explizit geleert</w:t>
-            </w:r>
+            <w:del w:id="3" w:author="Martin von Berg" w:date="2026-07-30T17:18:00Z" w16du:dateUtc="2026-07-30T15:18:00Z">
+              <w:r>
+                <w:rPr>
+                  <w:highlight w:val="yellow"/>
+                </w:rPr>
+                <w:delText>Gesammelte libxml-Fehler werden nicht explizit geleert</w:delText>
+              </w:r>
+            </w:del>
           </w:p>
         </w:tc>
       </w:tr>
@@ -2970,9 +2924,11 @@
             <w:tcW w:w="3264" w:type="dxa"/>
           </w:tcPr>
           <w:p>
-            <w:r>
-              <w:t>Update-Dateien</w:t>
-            </w:r>
+            <w:del w:id="4" w:author="Martin von Berg" w:date="2026-07-30T17:09:00Z" w16du:dateUtc="2026-07-30T15:09:00Z">
+              <w:r>
+                <w:delText>Update-Dateien</w:delText>
+              </w:r>
+            </w:del>
           </w:p>
         </w:tc>
         <w:tc>
@@ -2980,9 +2936,11 @@
             <w:tcW w:w="3264" w:type="dxa"/>
           </w:tcPr>
           <w:p>
-            <w:r>
-              <w:t>Slug-Prüfung und Fehlerabbruch bei Backup-Fehler</w:t>
-            </w:r>
+            <w:del w:id="5" w:author="Martin von Berg" w:date="2026-07-30T17:09:00Z" w16du:dateUtc="2026-07-30T15:09:00Z">
+              <w:r>
+                <w:delText>Slug-Prüfung und Fehlerabbruch bei Backup-Fehler</w:delText>
+              </w:r>
+            </w:del>
           </w:p>
         </w:tc>
         <w:tc>
@@ -2990,12 +2948,14 @@
             <w:tcW w:w="3264" w:type="dxa"/>
           </w:tcPr>
           <w:p>
-            <w:r>
-              <w:rPr>
-                <w:highlight w:val="yellow"/>
-              </w:rPr>
-              <w:t>Dateisystemoperationen verwenden 0777 und keine WP_Filesystem-Abstraktion</w:t>
-            </w:r>
+            <w:del w:id="6" w:author="Martin von Berg" w:date="2026-07-30T17:09:00Z" w16du:dateUtc="2026-07-30T15:09:00Z">
+              <w:r>
+                <w:rPr>
+                  <w:highlight w:val="yellow"/>
+                </w:rPr>
+                <w:delText>Dateisystemoperationen verwenden 0777 und keine WP_Filesystem-Abstraktion</w:delText>
+              </w:r>
+            </w:del>
           </w:p>
         </w:tc>
       </w:tr>
@@ -3143,7 +3103,7 @@
             <w:tcW w:w="3264" w:type="dxa"/>
           </w:tcPr>
           <w:p>
-            <w:del w:id="1" w:author="Martin von Berg" w:date="2026-07-29T10:52:00Z" w16du:dateUtc="2026-07-29T08:52:00Z">
+            <w:del w:id="7" w:author="Martin von Berg" w:date="2026-07-29T10:52:00Z" w16du:dateUtc="2026-07-29T08:52:00Z">
               <w:r>
                 <w:delText>1</w:delText>
               </w:r>
@@ -3155,7 +3115,7 @@
             <w:tcW w:w="3264" w:type="dxa"/>
           </w:tcPr>
           <w:p>
-            <w:del w:id="2" w:author="Martin von Berg" w:date="2026-07-29T10:52:00Z" w16du:dateUtc="2026-07-29T08:52:00Z">
+            <w:del w:id="8" w:author="Martin von Berg" w:date="2026-07-29T10:52:00Z" w16du:dateUtc="2026-07-29T08:52:00Z">
               <w:r>
                 <w:rPr>
                   <w:highlight w:val="yellow"/>
@@ -3170,7 +3130,7 @@
             <w:tcW w:w="3264" w:type="dxa"/>
           </w:tcPr>
           <w:p>
-            <w:del w:id="3" w:author="Martin von Berg" w:date="2026-07-29T10:52:00Z" w16du:dateUtc="2026-07-29T08:52:00Z">
+            <w:del w:id="9" w:author="Martin von Berg" w:date="2026-07-29T10:52:00Z" w16du:dateUtc="2026-07-29T08:52:00Z">
               <w:r>
                 <w:delText>Erhöhte Wartungslast; unklar, welche historische Variante maßgeblich ist</w:delText>
               </w:r>
@@ -3187,7 +3147,7 @@
             <w:tcW w:w="3264" w:type="dxa"/>
           </w:tcPr>
           <w:p>
-            <w:del w:id="4" w:author="Martin von Berg" w:date="2026-07-29T11:14:00Z" w16du:dateUtc="2026-07-29T09:14:00Z">
+            <w:del w:id="10" w:author="Martin von Berg" w:date="2026-07-29T11:14:00Z" w16du:dateUtc="2026-07-29T09:14:00Z">
               <w:r>
                 <w:delText>2</w:delText>
               </w:r>
@@ -3199,7 +3159,7 @@
             <w:tcW w:w="3264" w:type="dxa"/>
           </w:tcPr>
           <w:p>
-            <w:del w:id="5" w:author="Martin von Berg" w:date="2026-07-29T11:14:00Z" w16du:dateUtc="2026-07-29T09:14:00Z">
+            <w:del w:id="11" w:author="Martin von Berg" w:date="2026-07-29T11:14:00Z" w16du:dateUtc="2026-07-29T09:14:00Z">
               <w:r>
                 <w:rPr>
                   <w:highlight w:val="yellow"/>
@@ -3214,7 +3174,7 @@
             <w:tcW w:w="3264" w:type="dxa"/>
           </w:tcPr>
           <w:p>
-            <w:del w:id="6" w:author="Martin von Berg" w:date="2026-07-29T11:14:00Z" w16du:dateUtc="2026-07-29T09:14:00Z">
+            <w:del w:id="12" w:author="Martin von Berg" w:date="2026-07-29T11:14:00Z" w16du:dateUtc="2026-07-29T09:14:00Z">
               <w:r>
                 <w:delText>Home-/Front-Konfiguration kann abhängig von WordPress-Kontext wirkungslos sein</w:delText>
               </w:r>
@@ -3231,7 +3191,7 @@
             <w:tcW w:w="3264" w:type="dxa"/>
           </w:tcPr>
           <w:p>
-            <w:del w:id="7" w:author="Martin von Berg" w:date="2026-07-29T10:52:00Z" w16du:dateUtc="2026-07-29T08:52:00Z">
+            <w:del w:id="13" w:author="Martin von Berg" w:date="2026-07-29T10:52:00Z" w16du:dateUtc="2026-07-29T08:52:00Z">
               <w:r>
                 <w:delText>3</w:delText>
               </w:r>
@@ -3243,7 +3203,7 @@
             <w:tcW w:w="3264" w:type="dxa"/>
           </w:tcPr>
           <w:p>
-            <w:del w:id="8" w:author="Martin von Berg" w:date="2026-07-29T10:52:00Z" w16du:dateUtc="2026-07-29T08:52:00Z">
+            <w:del w:id="14" w:author="Martin von Berg" w:date="2026-07-29T10:52:00Z" w16du:dateUtc="2026-07-29T08:52:00Z">
               <w:r>
                 <w:rPr>
                   <w:highlight w:val="yellow"/>
@@ -3258,7 +3218,7 @@
             <w:tcW w:w="3264" w:type="dxa"/>
           </w:tcPr>
           <w:p>
-            <w:del w:id="9" w:author="Martin von Berg" w:date="2026-07-29T10:52:00Z" w16du:dateUtc="2026-07-29T08:52:00Z">
+            <w:del w:id="15" w:author="Martin von Berg" w:date="2026-07-29T10:52:00Z" w16du:dateUtc="2026-07-29T08:52:00Z">
               <w:r>
                 <w:delText>Bei fehlender nicht minifizierter Datei kann die Prüfung irreführend sein</w:delText>
               </w:r>
@@ -3275,7 +3235,7 @@
             <w:tcW w:w="3264" w:type="dxa"/>
           </w:tcPr>
           <w:p>
-            <w:del w:id="10" w:author="Martin von Berg" w:date="2026-07-29T10:52:00Z" w16du:dateUtc="2026-07-29T08:52:00Z">
+            <w:del w:id="16" w:author="Martin von Berg" w:date="2026-07-29T10:52:00Z" w16du:dateUtc="2026-07-29T08:52:00Z">
               <w:r>
                 <w:delText>4</w:delText>
               </w:r>
@@ -3287,7 +3247,7 @@
             <w:tcW w:w="3264" w:type="dxa"/>
           </w:tcPr>
           <w:p>
-            <w:del w:id="11" w:author="Martin von Berg" w:date="2026-07-29T10:52:00Z" w16du:dateUtc="2026-07-29T08:52:00Z">
+            <w:del w:id="17" w:author="Martin von Berg" w:date="2026-07-29T10:52:00Z" w16du:dateUtc="2026-07-29T08:52:00Z">
               <w:r>
                 <w:rPr>
                   <w:highlight w:val="yellow"/>
@@ -3302,7 +3262,7 @@
             <w:tcW w:w="3264" w:type="dxa"/>
           </w:tcPr>
           <w:p>
-            <w:del w:id="12" w:author="Martin von Berg" w:date="2026-07-29T10:52:00Z" w16du:dateUtc="2026-07-29T08:52:00Z">
+            <w:del w:id="18" w:author="Martin von Berg" w:date="2026-07-29T10:52:00Z" w16du:dateUtc="2026-07-29T08:52:00Z">
               <w:r>
                 <w:delText>WordPress löst Abhängigkeiten gewöhnlich auf; Reihenfolge sollte dennoch bewusst getestet werden</w:delText>
               </w:r>
@@ -3331,7 +3291,7 @@
           <w:p>
             <w:r>
               <w:rPr>
-                <w:rPrChange w:id="13" w:author="Martin von Berg" w:date="2026-07-29T11:16:00Z" w16du:dateUtc="2026-07-29T09:16:00Z">
+                <w:rPrChange w:id="19" w:author="Martin von Berg" w:date="2026-07-29T11:16:00Z" w16du:dateUtc="2026-07-29T09:16:00Z">
                   <w:rPr>
                     <w:highlight w:val="yellow"/>
                   </w:rPr>
@@ -3346,60 +3306,10 @@
             <w:tcW w:w="3264" w:type="dxa"/>
           </w:tcPr>
           <w:p>
-            <w:proofErr w:type="spellStart"/>
             <w:r>
-              <w:t>Doppelladungen</w:t>
+              <w:t>Doppelladungen oder Konflikte mit Optimierungsplugins sind möglich</w:t>
             </w:r>
-            <w:proofErr w:type="spellEnd"/>
-            <w:r>
-              <w:t xml:space="preserve"> </w:t>
-            </w:r>
-            <w:proofErr w:type="spellStart"/>
-            <w:r>
-              <w:t>oder</w:t>
-            </w:r>
-            <w:proofErr w:type="spellEnd"/>
-            <w:r>
-              <w:t xml:space="preserve"> </w:t>
-            </w:r>
-            <w:proofErr w:type="spellStart"/>
-            <w:r>
-              <w:t>Konflikte</w:t>
-            </w:r>
-            <w:proofErr w:type="spellEnd"/>
-            <w:r>
-              <w:t xml:space="preserve"> </w:t>
-            </w:r>
-            <w:proofErr w:type="spellStart"/>
-            <w:r>
-              <w:t>mit</w:t>
-            </w:r>
-            <w:proofErr w:type="spellEnd"/>
-            <w:r>
-              <w:t xml:space="preserve"> </w:t>
-            </w:r>
-            <w:proofErr w:type="spellStart"/>
-            <w:r>
-              <w:t>Optimierungsplugins</w:t>
-            </w:r>
-            <w:proofErr w:type="spellEnd"/>
-            <w:r>
-              <w:t xml:space="preserve"> </w:t>
-            </w:r>
-            <w:proofErr w:type="spellStart"/>
-            <w:r>
-              <w:t>sind</w:t>
-            </w:r>
-            <w:proofErr w:type="spellEnd"/>
-            <w:r>
-              <w:t xml:space="preserve"> </w:t>
-            </w:r>
-            <w:proofErr w:type="spellStart"/>
-            <w:r>
-              <w:t>möglich</w:t>
-            </w:r>
-            <w:proofErr w:type="spellEnd"/>
-            <w:ins w:id="14" w:author="Martin von Berg" w:date="2026-07-29T11:16:00Z" w16du:dateUtc="2026-07-29T09:16:00Z">
+            <w:ins w:id="20" w:author="Martin von Berg" w:date="2026-07-29T11:16:00Z" w16du:dateUtc="2026-07-29T09:16:00Z">
               <w:r>
                 <w:t xml:space="preserve"> </w:t>
               </w:r>
@@ -3407,47 +3317,7 @@
                 <w:sym w:font="Wingdings" w:char="F0E0"/>
               </w:r>
               <w:r>
-                <w:t xml:space="preserve"> Das </w:t>
-              </w:r>
-              <w:proofErr w:type="spellStart"/>
-              <w:r>
-                <w:t>ist</w:t>
-              </w:r>
-              <w:proofErr w:type="spellEnd"/>
-              <w:r>
-                <w:t xml:space="preserve"> </w:t>
-              </w:r>
-              <w:proofErr w:type="spellStart"/>
-              <w:r>
-                <w:t>Absicht</w:t>
-              </w:r>
-              <w:proofErr w:type="spellEnd"/>
-              <w:r>
-                <w:t xml:space="preserve"> und </w:t>
-              </w:r>
-              <w:proofErr w:type="spellStart"/>
-              <w:r>
-                <w:t>geht</w:t>
-              </w:r>
-              <w:proofErr w:type="spellEnd"/>
-              <w:r>
-                <w:t xml:space="preserve"> </w:t>
-              </w:r>
-              <w:proofErr w:type="spellStart"/>
-              <w:r>
-                <w:t>auch</w:t>
-              </w:r>
-              <w:proofErr w:type="spellEnd"/>
-              <w:r>
-                <w:t xml:space="preserve"> nicht </w:t>
-              </w:r>
-              <w:proofErr w:type="spellStart"/>
-              <w:r>
-                <w:t>anders</w:t>
-              </w:r>
-              <w:proofErr w:type="spellEnd"/>
-              <w:r>
-                <w:t xml:space="preserve">. </w:t>
+                <w:t xml:space="preserve"> Das ist Absicht und geht auch nicht anders. </w:t>
               </w:r>
             </w:ins>
           </w:p>
@@ -3472,12 +3342,14 @@
             <w:tcW w:w="3264" w:type="dxa"/>
           </w:tcPr>
           <w:p>
-            <w:r>
-              <w:rPr>
-                <w:highlight w:val="yellow"/>
-              </w:rPr>
-              <w:t>xcopy() propagiert Rückgabewerte rekursiver Unterkopien nicht</w:t>
-            </w:r>
+            <w:del w:id="21" w:author="Martin von Berg" w:date="2026-07-30T17:09:00Z" w16du:dateUtc="2026-07-30T15:09:00Z">
+              <w:r>
+                <w:rPr>
+                  <w:highlight w:val="yellow"/>
+                </w:rPr>
+                <w:delText>xcopy() propagiert Rückgabewerte rekursiver Unterkopien nicht</w:delText>
+              </w:r>
+            </w:del>
           </w:p>
         </w:tc>
         <w:tc>
@@ -3485,9 +3357,11 @@
             <w:tcW w:w="3264" w:type="dxa"/>
           </w:tcPr>
           <w:p>
-            <w:r>
-              <w:t>Teilweise fehlgeschlagene Verzeichniskopien können als erfolgreich erscheinen</w:t>
-            </w:r>
+            <w:del w:id="22" w:author="Martin von Berg" w:date="2026-07-30T17:09:00Z" w16du:dateUtc="2026-07-30T15:09:00Z">
+              <w:r>
+                <w:delText>Teilweise fehlgeschlagene Verzeichniskopien können als erfolgreich erscheinen</w:delText>
+              </w:r>
+            </w:del>
           </w:p>
         </w:tc>
       </w:tr>
@@ -3520,44 +3394,10 @@
             <w:tcW w:w="3264" w:type="dxa"/>
           </w:tcPr>
           <w:p>
-            <w:proofErr w:type="spellStart"/>
             <w:r>
-              <w:t>Veraltete</w:t>
+              <w:t>Veraltete Dateien und unnötiger Speicherverbrauch möglich</w:t>
             </w:r>
-            <w:proofErr w:type="spellEnd"/>
-            <w:r>
-              <w:t xml:space="preserve"> </w:t>
-            </w:r>
-            <w:proofErr w:type="spellStart"/>
-            <w:r>
-              <w:t>Dateien</w:t>
-            </w:r>
-            <w:proofErr w:type="spellEnd"/>
-            <w:r>
-              <w:t xml:space="preserve"> und </w:t>
-            </w:r>
-            <w:proofErr w:type="spellStart"/>
-            <w:r>
-              <w:t>unnötiger</w:t>
-            </w:r>
-            <w:proofErr w:type="spellEnd"/>
-            <w:r>
-              <w:t xml:space="preserve"> </w:t>
-            </w:r>
-            <w:proofErr w:type="spellStart"/>
-            <w:r>
-              <w:t>Speicherverbrauch</w:t>
-            </w:r>
-            <w:proofErr w:type="spellEnd"/>
-            <w:r>
-              <w:t xml:space="preserve"> </w:t>
-            </w:r>
-            <w:proofErr w:type="spellStart"/>
-            <w:r>
-              <w:t>möglich</w:t>
-            </w:r>
-            <w:proofErr w:type="spellEnd"/>
-            <w:ins w:id="15" w:author="Martin von Berg" w:date="2026-07-29T11:18:00Z" w16du:dateUtc="2026-07-29T09:18:00Z">
+            <w:ins w:id="23" w:author="Martin von Berg" w:date="2026-07-29T11:18:00Z" w16du:dateUtc="2026-07-29T09:18:00Z">
               <w:r>
                 <w:t xml:space="preserve"> </w:t>
               </w:r>
@@ -3565,47 +3405,7 @@
                 <w:sym w:font="Wingdings" w:char="F0E0"/>
               </w:r>
               <w:r>
-                <w:t xml:space="preserve"> Das </w:t>
-              </w:r>
-              <w:proofErr w:type="spellStart"/>
-              <w:r>
-                <w:t>ist</w:t>
-              </w:r>
-              <w:proofErr w:type="spellEnd"/>
-              <w:r>
-                <w:t xml:space="preserve"> </w:t>
-              </w:r>
-              <w:proofErr w:type="spellStart"/>
-              <w:r>
-                <w:t>Absicht</w:t>
-              </w:r>
-              <w:proofErr w:type="spellEnd"/>
-              <w:r>
-                <w:t xml:space="preserve"> und </w:t>
-              </w:r>
-              <w:proofErr w:type="spellStart"/>
-              <w:r>
-                <w:t>geht</w:t>
-              </w:r>
-              <w:proofErr w:type="spellEnd"/>
-              <w:r>
-                <w:t xml:space="preserve"> </w:t>
-              </w:r>
-              <w:proofErr w:type="spellStart"/>
-              <w:r>
-                <w:t>auch</w:t>
-              </w:r>
-              <w:proofErr w:type="spellEnd"/>
-              <w:r>
-                <w:t xml:space="preserve"> nicht </w:t>
-              </w:r>
-              <w:proofErr w:type="spellStart"/>
-              <w:r>
-                <w:t>anders</w:t>
-              </w:r>
-              <w:proofErr w:type="spellEnd"/>
-              <w:r>
-                <w:t>.</w:t>
+                <w:t xml:space="preserve"> Das ist Absicht und geht auch nicht anders.</w:t>
               </w:r>
             </w:ins>
           </w:p>
@@ -3620,9 +3420,11 @@
             <w:tcW w:w="3264" w:type="dxa"/>
           </w:tcPr>
           <w:p>
-            <w:r>
-              <w:t>8</w:t>
-            </w:r>
+            <w:del w:id="24" w:author="Martin von Berg" w:date="2026-07-29T15:33:00Z" w16du:dateUtc="2026-07-29T13:33:00Z">
+              <w:r>
+                <w:delText>8</w:delText>
+              </w:r>
+            </w:del>
           </w:p>
         </w:tc>
         <w:tc>
@@ -3630,12 +3432,14 @@
             <w:tcW w:w="3264" w:type="dxa"/>
           </w:tcPr>
           <w:p>
-            <w:r>
-              <w:rPr>
-                <w:highlight w:val="yellow"/>
-              </w:rPr>
-              <w:t>JSON wird nicht per json_last_error() oder Schema validiert</w:t>
-            </w:r>
+            <w:del w:id="25" w:author="Martin von Berg" w:date="2026-07-29T15:33:00Z" w16du:dateUtc="2026-07-29T13:33:00Z">
+              <w:r>
+                <w:rPr>
+                  <w:highlight w:val="yellow"/>
+                </w:rPr>
+                <w:delText>JSON wird nicht per json_last_error() oder Schema validiert</w:delText>
+              </w:r>
+            </w:del>
           </w:p>
         </w:tc>
         <w:tc>
@@ -3643,9 +3447,11 @@
             <w:tcW w:w="3264" w:type="dxa"/>
           </w:tcPr>
           <w:p>
-            <w:r>
-              <w:t>Ungültige Konfiguration kann zu Warnungen oder Typfehlern führen</w:t>
-            </w:r>
+            <w:del w:id="26" w:author="Martin von Berg" w:date="2026-07-29T15:33:00Z" w16du:dateUtc="2026-07-29T13:33:00Z">
+              <w:r>
+                <w:delText>Ungültige Konfiguration kann zu Warnungen oder Typfehlern führen</w:delText>
+              </w:r>
+            </w:del>
           </w:p>
         </w:tc>
       </w:tr>
@@ -3671,7 +3477,7 @@
           <w:p>
             <w:r>
               <w:rPr>
-                <w:rPrChange w:id="16" w:author="Martin von Berg" w:date="2026-07-29T11:18:00Z" w16du:dateUtc="2026-07-29T09:18:00Z">
+                <w:rPrChange w:id="27" w:author="Martin von Berg" w:date="2026-07-29T11:18:00Z" w16du:dateUtc="2026-07-29T09:18:00Z">
                   <w:rPr>
                     <w:highlight w:val="yellow"/>
                   </w:rPr>
@@ -3687,54 +3493,9 @@
           </w:tcPr>
           <w:p>
             <w:r>
-              <w:t>DOM-</w:t>
+              <w:t>DOM-Struktur und Attribute sollten für komplexe Theme-Markups gezielt getestet werden</w:t>
             </w:r>
-            <w:proofErr w:type="spellStart"/>
-            <w:r>
-              <w:t>Struktur</w:t>
-            </w:r>
-            <w:proofErr w:type="spellEnd"/>
-            <w:r>
-              <w:t xml:space="preserve"> und Attribute </w:t>
-            </w:r>
-            <w:proofErr w:type="spellStart"/>
-            <w:r>
-              <w:t>sollten</w:t>
-            </w:r>
-            <w:proofErr w:type="spellEnd"/>
-            <w:r>
-              <w:t xml:space="preserve"> für </w:t>
-            </w:r>
-            <w:proofErr w:type="spellStart"/>
-            <w:r>
-              <w:t>komplexe</w:t>
-            </w:r>
-            <w:proofErr w:type="spellEnd"/>
-            <w:r>
-              <w:t xml:space="preserve"> Theme-Markups </w:t>
-            </w:r>
-            <w:proofErr w:type="spellStart"/>
-            <w:r>
-              <w:t>gezielt</w:t>
-            </w:r>
-            <w:proofErr w:type="spellEnd"/>
-            <w:r>
-              <w:t xml:space="preserve"> </w:t>
-            </w:r>
-            <w:proofErr w:type="spellStart"/>
-            <w:r>
-              <w:t>getestet</w:t>
-            </w:r>
-            <w:proofErr w:type="spellEnd"/>
-            <w:r>
-              <w:t xml:space="preserve"> </w:t>
-            </w:r>
-            <w:proofErr w:type="spellStart"/>
-            <w:r>
-              <w:t>werden</w:t>
-            </w:r>
-            <w:proofErr w:type="spellEnd"/>
-            <w:ins w:id="17" w:author="Martin von Berg" w:date="2026-07-29T11:18:00Z" w16du:dateUtc="2026-07-29T09:18:00Z">
+            <w:ins w:id="28" w:author="Martin von Berg" w:date="2026-07-29T11:18:00Z" w16du:dateUtc="2026-07-29T09:18:00Z">
               <w:r>
                 <w:t xml:space="preserve"> </w:t>
               </w:r>
@@ -3742,23 +3503,7 @@
                 <w:sym w:font="Wingdings" w:char="F0E0"/>
               </w:r>
               <w:r>
-                <w:t xml:space="preserve"> Das </w:t>
-              </w:r>
-              <w:proofErr w:type="spellStart"/>
-              <w:r>
-                <w:t>ist</w:t>
-              </w:r>
-              <w:proofErr w:type="spellEnd"/>
-              <w:r>
-                <w:t xml:space="preserve"> </w:t>
-              </w:r>
-              <w:proofErr w:type="spellStart"/>
-              <w:r>
-                <w:t>Absicht</w:t>
-              </w:r>
-              <w:proofErr w:type="spellEnd"/>
-              <w:r>
-                <w:t xml:space="preserve"> </w:t>
+                <w:t xml:space="preserve"> Das ist Absicht </w:t>
               </w:r>
             </w:ins>
           </w:p>
@@ -3768,82 +3513,29 @@
     <w:p>
       <w:pPr>
         <w:rPr>
-          <w:ins w:id="18" w:author="Martin von Berg" w:date="2026-07-29T11:09:00Z" w16du:dateUtc="2026-07-29T09:09:00Z"/>
+          <w:ins w:id="29" w:author="Martin von Berg" w:date="2026-07-29T11:09:00Z" w16du:dateUtc="2026-07-29T09:09:00Z"/>
         </w:rPr>
       </w:pPr>
       <w:r>
-        <w:t xml:space="preserve">Diese Punkte sind technische Beobachtungen aus dem vorliegenden Quellstand und keine Aussage, dass der jeweilige Pfad im </w:t>
-      </w:r>
-      <w:proofErr w:type="spellStart"/>
-      <w:r>
-        <w:t>praktischen</w:t>
-      </w:r>
-      <w:proofErr w:type="spellEnd"/>
-      <w:r>
-        <w:t xml:space="preserve"> </w:t>
-      </w:r>
-      <w:proofErr w:type="spellStart"/>
-      <w:r>
-        <w:t>Betrieb</w:t>
-      </w:r>
-      <w:proofErr w:type="spellEnd"/>
-      <w:r>
-        <w:t xml:space="preserve"> </w:t>
-      </w:r>
-      <w:proofErr w:type="spellStart"/>
-      <w:r>
-        <w:t>fehlerhaft</w:t>
-      </w:r>
-      <w:proofErr w:type="spellEnd"/>
-      <w:r>
-        <w:t xml:space="preserve"> </w:t>
-      </w:r>
-      <w:proofErr w:type="spellStart"/>
-      <w:r>
-        <w:t>ist</w:t>
-      </w:r>
-      <w:proofErr w:type="spellEnd"/>
-      <w:r>
-        <w:t>.</w:t>
+        <w:t>Diese Punkte sind technische Beobachtungen aus dem vorliegenden Quellstand und keine Aussage, dass der jeweilige Pfad im praktischen Betrieb fehlerhaft ist.</w:t>
       </w:r>
     </w:p>
     <w:p>
       <w:pPr>
         <w:rPr>
-          <w:ins w:id="19" w:author="Martin von Berg" w:date="2026-07-29T11:09:00Z" w16du:dateUtc="2026-07-29T09:09:00Z"/>
+          <w:ins w:id="30" w:author="Martin von Berg" w:date="2026-07-29T11:09:00Z" w16du:dateUtc="2026-07-29T09:09:00Z"/>
         </w:rPr>
       </w:pPr>
     </w:p>
     <w:p>
       <w:pPr>
         <w:rPr>
-          <w:ins w:id="20" w:author="Martin von Berg" w:date="2026-07-29T11:09:00Z" w16du:dateUtc="2026-07-29T09:09:00Z"/>
+          <w:ins w:id="31" w:author="Martin von Berg" w:date="2026-07-29T11:09:00Z" w16du:dateUtc="2026-07-29T09:09:00Z"/>
         </w:rPr>
       </w:pPr>
-      <w:proofErr w:type="spellStart"/>
-      <w:ins w:id="21" w:author="Martin von Berg" w:date="2026-07-29T11:09:00Z" w16du:dateUtc="2026-07-29T09:09:00Z">
+      <w:ins w:id="32" w:author="Martin von Berg" w:date="2026-07-29T11:09:00Z" w16du:dateUtc="2026-07-29T09:09:00Z">
         <w:r>
-          <w:t>Analyse</w:t>
-        </w:r>
-        <w:proofErr w:type="spellEnd"/>
-        <w:r>
-          <w:t xml:space="preserve"> </w:t>
-        </w:r>
-        <w:proofErr w:type="spellStart"/>
-        <w:r>
-          <w:t>zu</w:t>
-        </w:r>
-        <w:proofErr w:type="spellEnd"/>
-        <w:r>
-          <w:t xml:space="preserve"> </w:t>
-        </w:r>
-        <w:proofErr w:type="spellStart"/>
-        <w:r>
-          <w:t>Punkt</w:t>
-        </w:r>
-        <w:proofErr w:type="spellEnd"/>
-        <w:r>
-          <w:t xml:space="preserve"> 2</w:t>
+          <w:t>Analyse zu Punkt 2</w:t>
         </w:r>
       </w:ins>
     </w:p>
@@ -3851,10 +3543,10 @@
       <w:pPr>
         <w:spacing w:after="200" w:line="276" w:lineRule="auto"/>
         <w:rPr>
-          <w:ins w:id="22" w:author="Martin von Berg" w:date="2026-07-29T11:09:00Z" w16du:dateUtc="2026-07-29T09:09:00Z"/>
+          <w:ins w:id="33" w:author="Martin von Berg" w:date="2026-07-29T11:09:00Z" w16du:dateUtc="2026-07-29T09:09:00Z"/>
         </w:rPr>
       </w:pPr>
-      <w:ins w:id="23" w:author="Martin von Berg" w:date="2026-07-29T11:09:00Z" w16du:dateUtc="2026-07-29T09:09:00Z">
+      <w:ins w:id="34" w:author="Martin von Berg" w:date="2026-07-29T11:09:00Z" w16du:dateUtc="2026-07-29T09:09:00Z">
         <w:r>
           <w:br w:type="page"/>
         </w:r>
@@ -3879,7 +3571,7 @@
           <w:right w:w="15" w:type="dxa"/>
         </w:tblCellMar>
         <w:tblLook w:val="04A0" w:firstRow="1" w:lastRow="0" w:firstColumn="1" w:lastColumn="0" w:noHBand="0" w:noVBand="1"/>
-        <w:tblPrChange w:id="24" w:author="Martin von Berg" w:date="2026-07-29T11:13:00Z" w16du:dateUtc="2026-07-29T09:13:00Z">
+        <w:tblPrChange w:id="35" w:author="Martin von Berg" w:date="2026-07-29T11:13:00Z" w16du:dateUtc="2026-07-29T09:13:00Z">
           <w:tblPr>
             <w:tblW w:w="0" w:type="auto"/>
             <w:tblCellSpacing w:w="15" w:type="dxa"/>
@@ -3899,19 +3591,19 @@
         <w:gridCol w:w="3103"/>
         <w:gridCol w:w="1192"/>
         <w:gridCol w:w="1214"/>
-        <w:tblGridChange w:id="25">
+        <w:tblGridChange w:id="36">
           <w:tblGrid>
-            <w:gridCol w:w="10"/>
-            <w:gridCol w:w="2317"/>
-            <w:gridCol w:w="11"/>
-            <w:gridCol w:w="2055"/>
-            <w:gridCol w:w="8"/>
-            <w:gridCol w:w="3095"/>
-            <w:gridCol w:w="21"/>
-            <w:gridCol w:w="1171"/>
-            <w:gridCol w:w="1"/>
-            <w:gridCol w:w="1203"/>
-            <w:gridCol w:w="10"/>
+            <w:gridCol w:w="90"/>
+            <w:gridCol w:w="2237"/>
+            <w:gridCol w:w="91"/>
+            <w:gridCol w:w="1975"/>
+            <w:gridCol w:w="88"/>
+            <w:gridCol w:w="3015"/>
+            <w:gridCol w:w="101"/>
+            <w:gridCol w:w="1091"/>
+            <w:gridCol w:w="81"/>
+            <w:gridCol w:w="1133"/>
+            <w:gridCol w:w="70"/>
           </w:tblGrid>
         </w:tblGridChange>
       </w:tblGrid>
@@ -3919,11 +3611,10 @@
         <w:trPr>
           <w:tblHeader/>
           <w:tblCellSpacing w:w="15" w:type="dxa"/>
-          <w:ins w:id="26" w:author="Martin von Berg" w:date="2026-07-29T11:09:00Z"/>
-          <w:trPrChange w:id="27" w:author="Martin von Berg" w:date="2026-07-29T11:13:00Z" w16du:dateUtc="2026-07-29T09:13:00Z">
+          <w:ins w:id="37" w:author="Martin von Berg" w:date="2026-07-29T11:09:00Z"/>
+          <w:trPrChange w:id="38" w:author="Martin von Berg" w:date="2026-07-29T11:13:00Z" w16du:dateUtc="2026-07-29T09:13:00Z">
             <w:trPr>
               <w:gridBefore w:val="1"/>
-              <w:gridAfter w:val="0"/>
               <w:tblHeader/>
               <w:tblCellSpacing w:w="15" w:type="dxa"/>
             </w:trPr>
@@ -3934,7 +3625,7 @@
             <w:tcW w:w="0" w:type="auto"/>
             <w:vAlign w:val="center"/>
             <w:hideMark/>
-            <w:tcPrChange w:id="28" w:author="Martin von Berg" w:date="2026-07-29T11:13:00Z" w16du:dateUtc="2026-07-29T09:13:00Z">
+            <w:tcPrChange w:id="39" w:author="Martin von Berg" w:date="2026-07-29T11:13:00Z" w16du:dateUtc="2026-07-29T09:13:00Z">
               <w:tcPr>
                 <w:tcW w:w="0" w:type="auto"/>
                 <w:gridSpan w:val="2"/>
@@ -3946,13 +3637,13 @@
           <w:p>
             <w:pPr>
               <w:rPr>
-                <w:ins w:id="29" w:author="Martin von Berg" w:date="2026-07-29T11:09:00Z"/>
+                <w:ins w:id="40" w:author="Martin von Berg" w:date="2026-07-29T11:09:00Z"/>
                 <w:b/>
                 <w:bCs/>
                 <w:lang w:val="de-DE"/>
               </w:rPr>
             </w:pPr>
-            <w:ins w:id="30" w:author="Martin von Berg" w:date="2026-07-29T11:09:00Z">
+            <w:ins w:id="41" w:author="Martin von Berg" w:date="2026-07-29T11:09:00Z">
               <w:r>
                 <w:rPr>
                   <w:b/>
@@ -3970,7 +3661,7 @@
             <w:tcW w:w="0" w:type="auto"/>
             <w:vAlign w:val="center"/>
             <w:hideMark/>
-            <w:tcPrChange w:id="31" w:author="Martin von Berg" w:date="2026-07-29T11:13:00Z" w16du:dateUtc="2026-07-29T09:13:00Z">
+            <w:tcPrChange w:id="42" w:author="Martin von Berg" w:date="2026-07-29T11:13:00Z" w16du:dateUtc="2026-07-29T09:13:00Z">
               <w:tcPr>
                 <w:tcW w:w="0" w:type="auto"/>
                 <w:gridSpan w:val="2"/>
@@ -3982,13 +3673,13 @@
           <w:p>
             <w:pPr>
               <w:rPr>
-                <w:ins w:id="32" w:author="Martin von Berg" w:date="2026-07-29T11:09:00Z"/>
+                <w:ins w:id="43" w:author="Martin von Berg" w:date="2026-07-29T11:09:00Z"/>
                 <w:b/>
                 <w:bCs/>
                 <w:lang w:val="de-DE"/>
               </w:rPr>
             </w:pPr>
-            <w:ins w:id="33" w:author="Martin von Berg" w:date="2026-07-29T11:09:00Z">
+            <w:ins w:id="44" w:author="Martin von Berg" w:date="2026-07-29T11:09:00Z">
               <w:r>
                 <w:rPr>
                   <w:b/>
@@ -4000,153 +3691,6 @@
             </w:ins>
           </w:p>
         </w:tc>
-        <w:tc>
-          <w:tcPr>
-            <w:tcW w:w="0" w:type="auto"/>
-            <w:vAlign w:val="center"/>
-            <w:hideMark/>
-            <w:tcPrChange w:id="34" w:author="Martin von Berg" w:date="2026-07-29T11:13:00Z" w16du:dateUtc="2026-07-29T09:13:00Z">
-              <w:tcPr>
-                <w:tcW w:w="0" w:type="auto"/>
-                <w:gridSpan w:val="2"/>
-                <w:vAlign w:val="center"/>
-                <w:hideMark/>
-              </w:tcPr>
-            </w:tcPrChange>
-          </w:tcPr>
-          <w:p>
-            <w:pPr>
-              <w:rPr>
-                <w:ins w:id="35" w:author="Martin von Berg" w:date="2026-07-29T11:09:00Z"/>
-                <w:b/>
-                <w:bCs/>
-                <w:lang w:val="de-DE"/>
-              </w:rPr>
-            </w:pPr>
-            <w:proofErr w:type="spellStart"/>
-            <w:ins w:id="36" w:author="Martin von Berg" w:date="2026-07-29T11:09:00Z">
-              <w:r>
-                <w:rPr>
-                  <w:b/>
-                  <w:bCs/>
-                  <w:lang w:val="de-DE"/>
-                </w:rPr>
-                <w:t>get_post_type</w:t>
-              </w:r>
-              <w:proofErr w:type="spellEnd"/>
-              <w:r>
-                <w:rPr>
-                  <w:b/>
-                  <w:bCs/>
-                  <w:lang w:val="de-DE"/>
-                </w:rPr>
-                <w:t>()</w:t>
-              </w:r>
-            </w:ins>
-          </w:p>
-        </w:tc>
-        <w:tc>
-          <w:tcPr>
-            <w:tcW w:w="0" w:type="auto"/>
-            <w:vAlign w:val="center"/>
-            <w:hideMark/>
-            <w:tcPrChange w:id="37" w:author="Martin von Berg" w:date="2026-07-29T11:13:00Z" w16du:dateUtc="2026-07-29T09:13:00Z">
-              <w:tcPr>
-                <w:tcW w:w="0" w:type="auto"/>
-                <w:gridSpan w:val="2"/>
-                <w:vAlign w:val="center"/>
-                <w:hideMark/>
-              </w:tcPr>
-            </w:tcPrChange>
-          </w:tcPr>
-          <w:p>
-            <w:pPr>
-              <w:rPr>
-                <w:ins w:id="38" w:author="Martin von Berg" w:date="2026-07-29T11:09:00Z"/>
-                <w:b/>
-                <w:bCs/>
-                <w:lang w:val="de-DE"/>
-              </w:rPr>
-            </w:pPr>
-            <w:proofErr w:type="spellStart"/>
-            <w:ins w:id="39" w:author="Martin von Berg" w:date="2026-07-29T11:09:00Z">
-              <w:r>
-                <w:rPr>
-                  <w:b/>
-                  <w:bCs/>
-                  <w:lang w:val="de-DE"/>
-                </w:rPr>
-                <w:t>is_singular</w:t>
-              </w:r>
-              <w:proofErr w:type="spellEnd"/>
-              <w:r>
-                <w:rPr>
-                  <w:b/>
-                  <w:bCs/>
-                  <w:lang w:val="de-DE"/>
-                </w:rPr>
-                <w:t>()</w:t>
-              </w:r>
-            </w:ins>
-          </w:p>
-        </w:tc>
-        <w:tc>
-          <w:tcPr>
-            <w:tcW w:w="0" w:type="auto"/>
-            <w:vAlign w:val="center"/>
-            <w:hideMark/>
-            <w:tcPrChange w:id="40" w:author="Martin von Berg" w:date="2026-07-29T11:13:00Z" w16du:dateUtc="2026-07-29T09:13:00Z">
-              <w:tcPr>
-                <w:tcW w:w="0" w:type="auto"/>
-                <w:vAlign w:val="center"/>
-                <w:hideMark/>
-              </w:tcPr>
-            </w:tcPrChange>
-          </w:tcPr>
-          <w:p>
-            <w:pPr>
-              <w:rPr>
-                <w:ins w:id="41" w:author="Martin von Berg" w:date="2026-07-29T11:09:00Z"/>
-                <w:b/>
-                <w:bCs/>
-                <w:lang w:val="de-DE"/>
-              </w:rPr>
-            </w:pPr>
-            <w:proofErr w:type="spellStart"/>
-            <w:ins w:id="42" w:author="Martin von Berg" w:date="2026-07-29T11:09:00Z">
-              <w:r>
-                <w:rPr>
-                  <w:b/>
-                  <w:bCs/>
-                  <w:lang w:val="de-DE"/>
-                </w:rPr>
-                <w:t>Rewrite</w:t>
-              </w:r>
-              <w:proofErr w:type="spellEnd"/>
-              <w:r>
-                <w:rPr>
-                  <w:b/>
-                  <w:bCs/>
-                  <w:lang w:val="de-DE"/>
-                </w:rPr>
-                <w:t xml:space="preserve"> aktuell</w:t>
-              </w:r>
-            </w:ins>
-          </w:p>
-        </w:tc>
-      </w:tr>
-      <w:tr>
-        <w:trPr>
-          <w:tblCellSpacing w:w="15" w:type="dxa"/>
-          <w:ins w:id="43" w:author="Martin von Berg" w:date="2026-07-29T11:09:00Z"/>
-          <w:trPrChange w:id="44" w:author="Martin von Berg" w:date="2026-07-29T11:13:00Z" w16du:dateUtc="2026-07-29T09:13:00Z">
-            <w:trPr>
-              <w:gridBefore w:val="1"/>
-              <w:gridAfter w:val="0"/>
-              <w:tblCellSpacing w:w="15" w:type="dxa"/>
-            </w:trPr>
-          </w:trPrChange>
-        </w:trPr>
         <w:tc>
           <w:tcPr>
             <w:tcW w:w="0" w:type="auto"/>
@@ -4165,15 +3709,19 @@
             <w:pPr>
               <w:rPr>
                 <w:ins w:id="46" w:author="Martin von Berg" w:date="2026-07-29T11:09:00Z"/>
+                <w:b/>
+                <w:bCs/>
                 <w:lang w:val="de-DE"/>
               </w:rPr>
             </w:pPr>
             <w:ins w:id="47" w:author="Martin von Berg" w:date="2026-07-29T11:09:00Z">
               <w:r>
                 <w:rPr>
+                  <w:b/>
+                  <w:bCs/>
                   <w:lang w:val="de-DE"/>
                 </w:rPr>
-                <w:t>Startseite zeigt neueste Beiträge</w:t>
+                <w:t>get_post_type()</w:t>
               </w:r>
             </w:ins>
           </w:p>
@@ -4196,15 +3744,19 @@
             <w:pPr>
               <w:rPr>
                 <w:ins w:id="49" w:author="Martin von Berg" w:date="2026-07-29T11:09:00Z"/>
+                <w:b/>
+                <w:bCs/>
                 <w:lang w:val="de-DE"/>
               </w:rPr>
             </w:pPr>
             <w:ins w:id="50" w:author="Martin von Berg" w:date="2026-07-29T11:09:00Z">
               <w:r>
                 <w:rPr>
+                  <w:b/>
+                  <w:bCs/>
                   <w:lang w:val="de-DE"/>
                 </w:rPr>
-                <w:t>Startseite und Beitragsindex</w:t>
+                <w:t>is_singular()</w:t>
               </w:r>
             </w:ins>
           </w:p>
@@ -4227,39 +3779,41 @@
             <w:pPr>
               <w:rPr>
                 <w:ins w:id="52" w:author="Martin von Berg" w:date="2026-07-29T11:09:00Z"/>
+                <w:b/>
+                <w:bCs/>
                 <w:lang w:val="de-DE"/>
               </w:rPr>
             </w:pPr>
             <w:ins w:id="53" w:author="Martin von Berg" w:date="2026-07-29T11:09:00Z">
               <w:r>
                 <w:rPr>
+                  <w:b/>
+                  <w:bCs/>
                   <w:lang w:val="de-DE"/>
                 </w:rPr>
-                <w:t xml:space="preserve">meist </w:t>
-              </w:r>
-              <w:proofErr w:type="spellStart"/>
-              <w:r>
-                <w:rPr>
-                  <w:lang w:val="de-DE"/>
-                </w:rPr>
-                <w:t>post</w:t>
-              </w:r>
-              <w:proofErr w:type="spellEnd"/>
-              <w:r>
-                <w:rPr>
-                  <w:lang w:val="de-DE"/>
-                </w:rPr>
-                <w:t xml:space="preserve"> beziehungsweise kontextabhängig</w:t>
+                <w:t>Rewrite aktuell</w:t>
               </w:r>
             </w:ins>
           </w:p>
         </w:tc>
+      </w:tr>
+      <w:tr>
+        <w:trPr>
+          <w:tblCellSpacing w:w="15" w:type="dxa"/>
+          <w:ins w:id="54" w:author="Martin von Berg" w:date="2026-07-29T11:09:00Z"/>
+          <w:trPrChange w:id="55" w:author="Martin von Berg" w:date="2026-07-29T11:13:00Z" w16du:dateUtc="2026-07-29T09:13:00Z">
+            <w:trPr>
+              <w:gridBefore w:val="1"/>
+              <w:tblCellSpacing w:w="15" w:type="dxa"/>
+            </w:trPr>
+          </w:trPrChange>
+        </w:trPr>
         <w:tc>
           <w:tcPr>
             <w:tcW w:w="0" w:type="auto"/>
             <w:vAlign w:val="center"/>
             <w:hideMark/>
-            <w:tcPrChange w:id="54" w:author="Martin von Berg" w:date="2026-07-29T11:13:00Z" w16du:dateUtc="2026-07-29T09:13:00Z">
+            <w:tcPrChange w:id="56" w:author="Martin von Berg" w:date="2026-07-29T11:13:00Z" w16du:dateUtc="2026-07-29T09:13:00Z">
               <w:tcPr>
                 <w:tcW w:w="0" w:type="auto"/>
                 <w:gridSpan w:val="2"/>
@@ -4271,19 +3825,17 @@
           <w:p>
             <w:pPr>
               <w:rPr>
-                <w:ins w:id="55" w:author="Martin von Berg" w:date="2026-07-29T11:09:00Z"/>
+                <w:ins w:id="57" w:author="Martin von Berg" w:date="2026-07-29T11:09:00Z"/>
                 <w:lang w:val="de-DE"/>
               </w:rPr>
             </w:pPr>
-            <w:proofErr w:type="spellStart"/>
-            <w:ins w:id="56" w:author="Martin von Berg" w:date="2026-07-29T11:09:00Z">
+            <w:ins w:id="58" w:author="Martin von Berg" w:date="2026-07-29T11:09:00Z">
               <w:r>
                 <w:rPr>
                   <w:lang w:val="de-DE"/>
                 </w:rPr>
-                <w:t>false</w:t>
+                <w:t>Startseite zeigt neueste Beiträge</w:t>
               </w:r>
-              <w:proofErr w:type="spellEnd"/>
             </w:ins>
           </w:p>
         </w:tc>
@@ -4292,9 +3844,10 @@
             <w:tcW w:w="0" w:type="auto"/>
             <w:vAlign w:val="center"/>
             <w:hideMark/>
-            <w:tcPrChange w:id="57" w:author="Martin von Berg" w:date="2026-07-29T11:13:00Z" w16du:dateUtc="2026-07-29T09:13:00Z">
+            <w:tcPrChange w:id="59" w:author="Martin von Berg" w:date="2026-07-29T11:13:00Z" w16du:dateUtc="2026-07-29T09:13:00Z">
               <w:tcPr>
                 <w:tcW w:w="0" w:type="auto"/>
+                <w:gridSpan w:val="2"/>
                 <w:vAlign w:val="center"/>
                 <w:hideMark/>
               </w:tcPr>
@@ -4303,33 +3856,20 @@
           <w:p>
             <w:pPr>
               <w:rPr>
-                <w:ins w:id="58" w:author="Martin von Berg" w:date="2026-07-29T11:09:00Z"/>
+                <w:ins w:id="60" w:author="Martin von Berg" w:date="2026-07-29T11:09:00Z"/>
                 <w:lang w:val="de-DE"/>
               </w:rPr>
             </w:pPr>
-            <w:ins w:id="59" w:author="Martin von Berg" w:date="2026-07-29T11:09:00Z">
+            <w:ins w:id="61" w:author="Martin von Berg" w:date="2026-07-29T11:09:00Z">
               <w:r>
                 <w:rPr>
                   <w:lang w:val="de-DE"/>
                 </w:rPr>
-                <w:t>nein</w:t>
+                <w:t>Startseite und Beitragsindex</w:t>
               </w:r>
             </w:ins>
           </w:p>
         </w:tc>
-      </w:tr>
-      <w:tr>
-        <w:trPr>
-          <w:tblCellSpacing w:w="15" w:type="dxa"/>
-          <w:ins w:id="60" w:author="Martin von Berg" w:date="2026-07-29T11:09:00Z"/>
-          <w:trPrChange w:id="61" w:author="Martin von Berg" w:date="2026-07-29T11:13:00Z" w16du:dateUtc="2026-07-29T09:13:00Z">
-            <w:trPr>
-              <w:gridBefore w:val="1"/>
-              <w:gridAfter w:val="0"/>
-              <w:tblCellSpacing w:w="15" w:type="dxa"/>
-            </w:trPr>
-          </w:trPrChange>
-        </w:trPr>
         <w:tc>
           <w:tcPr>
             <w:tcW w:w="0" w:type="auto"/>
@@ -4356,7 +3896,7 @@
                 <w:rPr>
                   <w:lang w:val="de-DE"/>
                 </w:rPr>
-                <w:t>Statische Seite als Startseite</w:t>
+                <w:t>meist post beziehungsweise kontextabhängig</w:t>
               </w:r>
             </w:ins>
           </w:p>
@@ -4387,7 +3927,7 @@
                 <w:rPr>
                   <w:lang w:val="de-DE"/>
                 </w:rPr>
-                <w:t>Startseite</w:t>
+                <w:t>false</w:t>
               </w:r>
             </w:ins>
           </w:p>
@@ -4413,24 +3953,34 @@
                 <w:lang w:val="de-DE"/>
               </w:rPr>
             </w:pPr>
-            <w:proofErr w:type="spellStart"/>
             <w:ins w:id="70" w:author="Martin von Berg" w:date="2026-07-29T11:09:00Z">
               <w:r>
                 <w:rPr>
                   <w:lang w:val="de-DE"/>
                 </w:rPr>
-                <w:t>page</w:t>
+                <w:t>nein</w:t>
               </w:r>
-              <w:proofErr w:type="spellEnd"/>
             </w:ins>
           </w:p>
         </w:tc>
+      </w:tr>
+      <w:tr>
+        <w:trPr>
+          <w:tblCellSpacing w:w="15" w:type="dxa"/>
+          <w:ins w:id="71" w:author="Martin von Berg" w:date="2026-07-29T11:09:00Z"/>
+          <w:trPrChange w:id="72" w:author="Martin von Berg" w:date="2026-07-29T11:13:00Z" w16du:dateUtc="2026-07-29T09:13:00Z">
+            <w:trPr>
+              <w:gridBefore w:val="1"/>
+              <w:tblCellSpacing w:w="15" w:type="dxa"/>
+            </w:trPr>
+          </w:trPrChange>
+        </w:trPr>
         <w:tc>
           <w:tcPr>
             <w:tcW w:w="0" w:type="auto"/>
             <w:vAlign w:val="center"/>
             <w:hideMark/>
-            <w:tcPrChange w:id="71" w:author="Martin von Berg" w:date="2026-07-29T11:13:00Z" w16du:dateUtc="2026-07-29T09:13:00Z">
+            <w:tcPrChange w:id="73" w:author="Martin von Berg" w:date="2026-07-29T11:13:00Z" w16du:dateUtc="2026-07-29T09:13:00Z">
               <w:tcPr>
                 <w:tcW w:w="0" w:type="auto"/>
                 <w:gridSpan w:val="2"/>
@@ -4442,19 +3992,17 @@
           <w:p>
             <w:pPr>
               <w:rPr>
-                <w:ins w:id="72" w:author="Martin von Berg" w:date="2026-07-29T11:09:00Z"/>
+                <w:ins w:id="74" w:author="Martin von Berg" w:date="2026-07-29T11:09:00Z"/>
                 <w:lang w:val="de-DE"/>
               </w:rPr>
             </w:pPr>
-            <w:proofErr w:type="spellStart"/>
-            <w:ins w:id="73" w:author="Martin von Berg" w:date="2026-07-29T11:09:00Z">
+            <w:ins w:id="75" w:author="Martin von Berg" w:date="2026-07-29T11:09:00Z">
               <w:r>
                 <w:rPr>
                   <w:lang w:val="de-DE"/>
                 </w:rPr>
-                <w:t>true</w:t>
+                <w:t>Statische Seite als Startseite</w:t>
               </w:r>
-              <w:proofErr w:type="spellEnd"/>
             </w:ins>
           </w:p>
         </w:tc>
@@ -4463,9 +4011,10 @@
             <w:tcW w:w="0" w:type="auto"/>
             <w:vAlign w:val="center"/>
             <w:hideMark/>
-            <w:tcPrChange w:id="74" w:author="Martin von Berg" w:date="2026-07-29T11:13:00Z" w16du:dateUtc="2026-07-29T09:13:00Z">
+            <w:tcPrChange w:id="76" w:author="Martin von Berg" w:date="2026-07-29T11:13:00Z" w16du:dateUtc="2026-07-29T09:13:00Z">
               <w:tcPr>
                 <w:tcW w:w="0" w:type="auto"/>
+                <w:gridSpan w:val="2"/>
                 <w:vAlign w:val="center"/>
                 <w:hideMark/>
               </w:tcPr>
@@ -4474,41 +4023,20 @@
           <w:p>
             <w:pPr>
               <w:rPr>
-                <w:ins w:id="75" w:author="Martin von Berg" w:date="2026-07-29T11:09:00Z"/>
+                <w:ins w:id="77" w:author="Martin von Berg" w:date="2026-07-29T11:09:00Z"/>
                 <w:lang w:val="de-DE"/>
               </w:rPr>
             </w:pPr>
-            <w:ins w:id="76" w:author="Martin von Berg" w:date="2026-07-29T11:09:00Z">
+            <w:ins w:id="78" w:author="Martin von Berg" w:date="2026-07-29T11:09:00Z">
               <w:r>
                 <w:rPr>
                   <w:lang w:val="de-DE"/>
                 </w:rPr>
-                <w:t xml:space="preserve">ja, wegen </w:t>
+                <w:t>Startseite</w:t>
               </w:r>
-              <w:proofErr w:type="spellStart"/>
-              <w:r>
-                <w:rPr>
-                  <w:lang w:val="de-DE"/>
-                </w:rPr>
-                <w:t>page</w:t>
-              </w:r>
-              <w:proofErr w:type="spellEnd"/>
             </w:ins>
           </w:p>
         </w:tc>
-      </w:tr>
-      <w:tr>
-        <w:trPr>
-          <w:tblCellSpacing w:w="15" w:type="dxa"/>
-          <w:ins w:id="77" w:author="Martin von Berg" w:date="2026-07-29T11:09:00Z"/>
-          <w:trPrChange w:id="78" w:author="Martin von Berg" w:date="2026-07-29T11:13:00Z" w16du:dateUtc="2026-07-29T09:13:00Z">
-            <w:trPr>
-              <w:gridBefore w:val="1"/>
-              <w:gridAfter w:val="0"/>
-              <w:tblCellSpacing w:w="15" w:type="dxa"/>
-            </w:trPr>
-          </w:trPrChange>
-        </w:trPr>
         <w:tc>
           <w:tcPr>
             <w:tcW w:w="0" w:type="auto"/>
@@ -4535,7 +4063,7 @@
                 <w:rPr>
                   <w:lang w:val="de-DE"/>
                 </w:rPr>
-                <w:t>Separate statische Beitragsseite</w:t>
+                <w:t>page</w:t>
               </w:r>
             </w:ins>
           </w:p>
@@ -4566,7 +4094,7 @@
                 <w:rPr>
                   <w:lang w:val="de-DE"/>
                 </w:rPr>
-                <w:t>Beitragsindex</w:t>
+                <w:t>true</w:t>
               </w:r>
             </w:ins>
           </w:p>
@@ -4597,31 +4125,29 @@
                 <w:rPr>
                   <w:lang w:val="de-DE"/>
                 </w:rPr>
-                <w:t xml:space="preserve">typischerweise </w:t>
-              </w:r>
-              <w:proofErr w:type="spellStart"/>
-              <w:r>
-                <w:rPr>
-                  <w:lang w:val="de-DE"/>
-                </w:rPr>
-                <w:t>page</w:t>
-              </w:r>
-              <w:proofErr w:type="spellEnd"/>
-              <w:r>
-                <w:rPr>
-                  <w:lang w:val="de-DE"/>
-                </w:rPr>
-                <w:t xml:space="preserve"> als abgefragtes Objekt</w:t>
+                <w:t>ja, wegen page</w:t>
               </w:r>
             </w:ins>
           </w:p>
         </w:tc>
+      </w:tr>
+      <w:tr>
+        <w:trPr>
+          <w:tblCellSpacing w:w="15" w:type="dxa"/>
+          <w:ins w:id="88" w:author="Martin von Berg" w:date="2026-07-29T11:09:00Z"/>
+          <w:trPrChange w:id="89" w:author="Martin von Berg" w:date="2026-07-29T11:13:00Z" w16du:dateUtc="2026-07-29T09:13:00Z">
+            <w:trPr>
+              <w:gridBefore w:val="1"/>
+              <w:tblCellSpacing w:w="15" w:type="dxa"/>
+            </w:trPr>
+          </w:trPrChange>
+        </w:trPr>
         <w:tc>
           <w:tcPr>
             <w:tcW w:w="0" w:type="auto"/>
             <w:vAlign w:val="center"/>
             <w:hideMark/>
-            <w:tcPrChange w:id="88" w:author="Martin von Berg" w:date="2026-07-29T11:13:00Z" w16du:dateUtc="2026-07-29T09:13:00Z">
+            <w:tcPrChange w:id="90" w:author="Martin von Berg" w:date="2026-07-29T11:13:00Z" w16du:dateUtc="2026-07-29T09:13:00Z">
               <w:tcPr>
                 <w:tcW w:w="0" w:type="auto"/>
                 <w:gridSpan w:val="2"/>
@@ -4633,19 +4159,17 @@
           <w:p>
             <w:pPr>
               <w:rPr>
-                <w:ins w:id="89" w:author="Martin von Berg" w:date="2026-07-29T11:09:00Z"/>
+                <w:ins w:id="91" w:author="Martin von Berg" w:date="2026-07-29T11:09:00Z"/>
                 <w:lang w:val="de-DE"/>
               </w:rPr>
             </w:pPr>
-            <w:proofErr w:type="spellStart"/>
-            <w:ins w:id="90" w:author="Martin von Berg" w:date="2026-07-29T11:09:00Z">
+            <w:ins w:id="92" w:author="Martin von Berg" w:date="2026-07-29T11:09:00Z">
               <w:r>
                 <w:rPr>
                   <w:lang w:val="de-DE"/>
                 </w:rPr>
-                <w:t>false</w:t>
+                <w:t>Separate statische Beitragsseite</w:t>
               </w:r>
-              <w:proofErr w:type="spellEnd"/>
             </w:ins>
           </w:p>
         </w:tc>
@@ -4654,9 +4178,10 @@
             <w:tcW w:w="0" w:type="auto"/>
             <w:vAlign w:val="center"/>
             <w:hideMark/>
-            <w:tcPrChange w:id="91" w:author="Martin von Berg" w:date="2026-07-29T11:13:00Z" w16du:dateUtc="2026-07-29T09:13:00Z">
+            <w:tcPrChange w:id="93" w:author="Martin von Berg" w:date="2026-07-29T11:13:00Z" w16du:dateUtc="2026-07-29T09:13:00Z">
               <w:tcPr>
                 <w:tcW w:w="0" w:type="auto"/>
+                <w:gridSpan w:val="2"/>
                 <w:vAlign w:val="center"/>
                 <w:hideMark/>
               </w:tcPr>
@@ -4665,33 +4190,20 @@
           <w:p>
             <w:pPr>
               <w:rPr>
-                <w:ins w:id="92" w:author="Martin von Berg" w:date="2026-07-29T11:09:00Z"/>
+                <w:ins w:id="94" w:author="Martin von Berg" w:date="2026-07-29T11:09:00Z"/>
                 <w:lang w:val="de-DE"/>
               </w:rPr>
             </w:pPr>
-            <w:ins w:id="93" w:author="Martin von Berg" w:date="2026-07-29T11:09:00Z">
+            <w:ins w:id="95" w:author="Martin von Berg" w:date="2026-07-29T11:09:00Z">
               <w:r>
                 <w:rPr>
                   <w:lang w:val="de-DE"/>
                 </w:rPr>
-                <w:t>nein</w:t>
+                <w:t>Beitragsindex</w:t>
               </w:r>
             </w:ins>
           </w:p>
         </w:tc>
-      </w:tr>
-      <w:tr>
-        <w:trPr>
-          <w:tblCellSpacing w:w="15" w:type="dxa"/>
-          <w:ins w:id="94" w:author="Martin von Berg" w:date="2026-07-29T11:09:00Z"/>
-          <w:trPrChange w:id="95" w:author="Martin von Berg" w:date="2026-07-29T11:13:00Z" w16du:dateUtc="2026-07-29T09:13:00Z">
-            <w:trPr>
-              <w:gridBefore w:val="1"/>
-              <w:gridAfter w:val="0"/>
-              <w:tblCellSpacing w:w="15" w:type="dxa"/>
-            </w:trPr>
-          </w:trPrChange>
-        </w:trPr>
         <w:tc>
           <w:tcPr>
             <w:tcW w:w="0" w:type="auto"/>
@@ -4718,7 +4230,7 @@
                 <w:rPr>
                   <w:lang w:val="de-DE"/>
                 </w:rPr>
-                <w:t>Einzelner Beitrag</w:t>
+                <w:t>typischerweise page als abgefragtes Objekt</w:t>
               </w:r>
             </w:ins>
           </w:p>
@@ -4749,7 +4261,7 @@
                 <w:rPr>
                   <w:lang w:val="de-DE"/>
                 </w:rPr>
-                <w:t>Single Post</w:t>
+                <w:t>false</w:t>
               </w:r>
             </w:ins>
           </w:p>
@@ -4775,24 +4287,34 @@
                 <w:lang w:val="de-DE"/>
               </w:rPr>
             </w:pPr>
-            <w:proofErr w:type="spellStart"/>
             <w:ins w:id="104" w:author="Martin von Berg" w:date="2026-07-29T11:09:00Z">
               <w:r>
                 <w:rPr>
                   <w:lang w:val="de-DE"/>
                 </w:rPr>
-                <w:t>post</w:t>
+                <w:t>nein</w:t>
               </w:r>
-              <w:proofErr w:type="spellEnd"/>
             </w:ins>
           </w:p>
         </w:tc>
+      </w:tr>
+      <w:tr>
+        <w:trPr>
+          <w:tblCellSpacing w:w="15" w:type="dxa"/>
+          <w:ins w:id="105" w:author="Martin von Berg" w:date="2026-07-29T11:09:00Z"/>
+          <w:trPrChange w:id="106" w:author="Martin von Berg" w:date="2026-07-29T11:13:00Z" w16du:dateUtc="2026-07-29T09:13:00Z">
+            <w:trPr>
+              <w:gridBefore w:val="1"/>
+              <w:tblCellSpacing w:w="15" w:type="dxa"/>
+            </w:trPr>
+          </w:trPrChange>
+        </w:trPr>
         <w:tc>
           <w:tcPr>
             <w:tcW w:w="0" w:type="auto"/>
             <w:vAlign w:val="center"/>
             <w:hideMark/>
-            <w:tcPrChange w:id="105" w:author="Martin von Berg" w:date="2026-07-29T11:13:00Z" w16du:dateUtc="2026-07-29T09:13:00Z">
+            <w:tcPrChange w:id="107" w:author="Martin von Berg" w:date="2026-07-29T11:13:00Z" w16du:dateUtc="2026-07-29T09:13:00Z">
               <w:tcPr>
                 <w:tcW w:w="0" w:type="auto"/>
                 <w:gridSpan w:val="2"/>
@@ -4804,19 +4326,17 @@
           <w:p>
             <w:pPr>
               <w:rPr>
-                <w:ins w:id="106" w:author="Martin von Berg" w:date="2026-07-29T11:09:00Z"/>
+                <w:ins w:id="108" w:author="Martin von Berg" w:date="2026-07-29T11:09:00Z"/>
                 <w:lang w:val="de-DE"/>
               </w:rPr>
             </w:pPr>
-            <w:proofErr w:type="spellStart"/>
-            <w:ins w:id="107" w:author="Martin von Berg" w:date="2026-07-29T11:09:00Z">
+            <w:ins w:id="109" w:author="Martin von Berg" w:date="2026-07-29T11:09:00Z">
               <w:r>
                 <w:rPr>
                   <w:lang w:val="de-DE"/>
                 </w:rPr>
-                <w:t>true</w:t>
+                <w:t>Einzelner Beitrag</w:t>
               </w:r>
-              <w:proofErr w:type="spellEnd"/>
             </w:ins>
           </w:p>
         </w:tc>
@@ -4825,9 +4345,10 @@
             <w:tcW w:w="0" w:type="auto"/>
             <w:vAlign w:val="center"/>
             <w:hideMark/>
-            <w:tcPrChange w:id="108" w:author="Martin von Berg" w:date="2026-07-29T11:13:00Z" w16du:dateUtc="2026-07-29T09:13:00Z">
+            <w:tcPrChange w:id="110" w:author="Martin von Berg" w:date="2026-07-29T11:13:00Z" w16du:dateUtc="2026-07-29T09:13:00Z">
               <w:tcPr>
                 <w:tcW w:w="0" w:type="auto"/>
+                <w:gridSpan w:val="2"/>
                 <w:vAlign w:val="center"/>
                 <w:hideMark/>
               </w:tcPr>
@@ -4836,33 +4357,20 @@
           <w:p>
             <w:pPr>
               <w:rPr>
-                <w:ins w:id="109" w:author="Martin von Berg" w:date="2026-07-29T11:09:00Z"/>
+                <w:ins w:id="111" w:author="Martin von Berg" w:date="2026-07-29T11:09:00Z"/>
                 <w:lang w:val="de-DE"/>
               </w:rPr>
             </w:pPr>
-            <w:ins w:id="110" w:author="Martin von Berg" w:date="2026-07-29T11:09:00Z">
+            <w:ins w:id="112" w:author="Martin von Berg" w:date="2026-07-29T11:09:00Z">
               <w:r>
                 <w:rPr>
                   <w:lang w:val="de-DE"/>
                 </w:rPr>
-                <w:t>ja</w:t>
+                <w:t>Single Post</w:t>
               </w:r>
             </w:ins>
           </w:p>
         </w:tc>
-      </w:tr>
-      <w:tr>
-        <w:trPr>
-          <w:tblCellSpacing w:w="15" w:type="dxa"/>
-          <w:ins w:id="111" w:author="Martin von Berg" w:date="2026-07-29T11:09:00Z"/>
-          <w:trPrChange w:id="112" w:author="Martin von Berg" w:date="2026-07-29T11:13:00Z" w16du:dateUtc="2026-07-29T09:13:00Z">
-            <w:trPr>
-              <w:gridBefore w:val="1"/>
-              <w:gridAfter w:val="0"/>
-              <w:tblCellSpacing w:w="15" w:type="dxa"/>
-            </w:trPr>
-          </w:trPrChange>
-        </w:trPr>
         <w:tc>
           <w:tcPr>
             <w:tcW w:w="0" w:type="auto"/>
@@ -4889,7 +4397,7 @@
                 <w:rPr>
                   <w:lang w:val="de-DE"/>
                 </w:rPr>
-                <w:t>Einzelne Seite</w:t>
+                <w:t>post</w:t>
               </w:r>
             </w:ins>
           </w:p>
@@ -4920,7 +4428,7 @@
                 <w:rPr>
                   <w:lang w:val="de-DE"/>
                 </w:rPr>
-                <w:t>Page</w:t>
+                <w:t>true</w:t>
               </w:r>
             </w:ins>
           </w:p>
@@ -4946,24 +4454,34 @@
                 <w:lang w:val="de-DE"/>
               </w:rPr>
             </w:pPr>
-            <w:proofErr w:type="spellStart"/>
             <w:ins w:id="121" w:author="Martin von Berg" w:date="2026-07-29T11:09:00Z">
               <w:r>
                 <w:rPr>
                   <w:lang w:val="de-DE"/>
                 </w:rPr>
-                <w:t>page</w:t>
+                <w:t>ja</w:t>
               </w:r>
-              <w:proofErr w:type="spellEnd"/>
             </w:ins>
           </w:p>
         </w:tc>
+      </w:tr>
+      <w:tr>
+        <w:trPr>
+          <w:tblCellSpacing w:w="15" w:type="dxa"/>
+          <w:ins w:id="122" w:author="Martin von Berg" w:date="2026-07-29T11:09:00Z"/>
+          <w:trPrChange w:id="123" w:author="Martin von Berg" w:date="2026-07-29T11:13:00Z" w16du:dateUtc="2026-07-29T09:13:00Z">
+            <w:trPr>
+              <w:gridBefore w:val="1"/>
+              <w:tblCellSpacing w:w="15" w:type="dxa"/>
+            </w:trPr>
+          </w:trPrChange>
+        </w:trPr>
         <w:tc>
           <w:tcPr>
             <w:tcW w:w="0" w:type="auto"/>
             <w:vAlign w:val="center"/>
             <w:hideMark/>
-            <w:tcPrChange w:id="122" w:author="Martin von Berg" w:date="2026-07-29T11:13:00Z" w16du:dateUtc="2026-07-29T09:13:00Z">
+            <w:tcPrChange w:id="124" w:author="Martin von Berg" w:date="2026-07-29T11:13:00Z" w16du:dateUtc="2026-07-29T09:13:00Z">
               <w:tcPr>
                 <w:tcW w:w="0" w:type="auto"/>
                 <w:gridSpan w:val="2"/>
@@ -4975,19 +4493,110 @@
           <w:p>
             <w:pPr>
               <w:rPr>
-                <w:ins w:id="123" w:author="Martin von Berg" w:date="2026-07-29T11:09:00Z"/>
+                <w:ins w:id="125" w:author="Martin von Berg" w:date="2026-07-29T11:09:00Z"/>
                 <w:lang w:val="de-DE"/>
               </w:rPr>
             </w:pPr>
-            <w:proofErr w:type="spellStart"/>
-            <w:ins w:id="124" w:author="Martin von Berg" w:date="2026-07-29T11:09:00Z">
+            <w:ins w:id="126" w:author="Martin von Berg" w:date="2026-07-29T11:09:00Z">
+              <w:r>
+                <w:rPr>
+                  <w:lang w:val="de-DE"/>
+                </w:rPr>
+                <w:t>Einzelne Seite</w:t>
+              </w:r>
+            </w:ins>
+          </w:p>
+        </w:tc>
+        <w:tc>
+          <w:tcPr>
+            <w:tcW w:w="0" w:type="auto"/>
+            <w:vAlign w:val="center"/>
+            <w:hideMark/>
+            <w:tcPrChange w:id="127" w:author="Martin von Berg" w:date="2026-07-29T11:13:00Z" w16du:dateUtc="2026-07-29T09:13:00Z">
+              <w:tcPr>
+                <w:tcW w:w="0" w:type="auto"/>
+                <w:gridSpan w:val="2"/>
+                <w:vAlign w:val="center"/>
+                <w:hideMark/>
+              </w:tcPr>
+            </w:tcPrChange>
+          </w:tcPr>
+          <w:p>
+            <w:pPr>
+              <w:rPr>
+                <w:ins w:id="128" w:author="Martin von Berg" w:date="2026-07-29T11:09:00Z"/>
+                <w:lang w:val="de-DE"/>
+              </w:rPr>
+            </w:pPr>
+            <w:ins w:id="129" w:author="Martin von Berg" w:date="2026-07-29T11:09:00Z">
+              <w:r>
+                <w:rPr>
+                  <w:lang w:val="de-DE"/>
+                </w:rPr>
+                <w:t>Page</w:t>
+              </w:r>
+            </w:ins>
+          </w:p>
+        </w:tc>
+        <w:tc>
+          <w:tcPr>
+            <w:tcW w:w="0" w:type="auto"/>
+            <w:vAlign w:val="center"/>
+            <w:hideMark/>
+            <w:tcPrChange w:id="130" w:author="Martin von Berg" w:date="2026-07-29T11:13:00Z" w16du:dateUtc="2026-07-29T09:13:00Z">
+              <w:tcPr>
+                <w:tcW w:w="0" w:type="auto"/>
+                <w:gridSpan w:val="2"/>
+                <w:vAlign w:val="center"/>
+                <w:hideMark/>
+              </w:tcPr>
+            </w:tcPrChange>
+          </w:tcPr>
+          <w:p>
+            <w:pPr>
+              <w:rPr>
+                <w:ins w:id="131" w:author="Martin von Berg" w:date="2026-07-29T11:09:00Z"/>
+                <w:lang w:val="de-DE"/>
+              </w:rPr>
+            </w:pPr>
+            <w:ins w:id="132" w:author="Martin von Berg" w:date="2026-07-29T11:09:00Z">
+              <w:r>
+                <w:rPr>
+                  <w:lang w:val="de-DE"/>
+                </w:rPr>
+                <w:t>page</w:t>
+              </w:r>
+            </w:ins>
+          </w:p>
+        </w:tc>
+        <w:tc>
+          <w:tcPr>
+            <w:tcW w:w="0" w:type="auto"/>
+            <w:vAlign w:val="center"/>
+            <w:hideMark/>
+            <w:tcPrChange w:id="133" w:author="Martin von Berg" w:date="2026-07-29T11:13:00Z" w16du:dateUtc="2026-07-29T09:13:00Z">
+              <w:tcPr>
+                <w:tcW w:w="0" w:type="auto"/>
+                <w:gridSpan w:val="2"/>
+                <w:vAlign w:val="center"/>
+                <w:hideMark/>
+              </w:tcPr>
+            </w:tcPrChange>
+          </w:tcPr>
+          <w:p>
+            <w:pPr>
+              <w:rPr>
+                <w:ins w:id="134" w:author="Martin von Berg" w:date="2026-07-29T11:09:00Z"/>
+                <w:lang w:val="de-DE"/>
+              </w:rPr>
+            </w:pPr>
+            <w:ins w:id="135" w:author="Martin von Berg" w:date="2026-07-29T11:09:00Z">
               <w:r>
                 <w:rPr>
                   <w:lang w:val="de-DE"/>
                 </w:rPr>
                 <w:t>true</w:t>
               </w:r>
-              <w:proofErr w:type="spellEnd"/>
             </w:ins>
           </w:p>
         </w:tc>
@@ -4996,9 +4605,10 @@
             <w:tcW w:w="0" w:type="auto"/>
             <w:vAlign w:val="center"/>
             <w:hideMark/>
-            <w:tcPrChange w:id="125" w:author="Martin von Berg" w:date="2026-07-29T11:13:00Z" w16du:dateUtc="2026-07-29T09:13:00Z">
+            <w:tcPrChange w:id="136" w:author="Martin von Berg" w:date="2026-07-29T11:13:00Z" w16du:dateUtc="2026-07-29T09:13:00Z">
               <w:tcPr>
                 <w:tcW w:w="0" w:type="auto"/>
+                <w:gridSpan w:val="2"/>
                 <w:vAlign w:val="center"/>
                 <w:hideMark/>
               </w:tcPr>
@@ -5007,11 +4617,11 @@
           <w:p>
             <w:pPr>
               <w:rPr>
-                <w:ins w:id="126" w:author="Martin von Berg" w:date="2026-07-29T11:09:00Z"/>
+                <w:ins w:id="137" w:author="Martin von Berg" w:date="2026-07-29T11:09:00Z"/>
                 <w:lang w:val="de-DE"/>
               </w:rPr>
             </w:pPr>
-            <w:ins w:id="127" w:author="Martin von Berg" w:date="2026-07-29T11:09:00Z">
+            <w:ins w:id="138" w:author="Martin von Berg" w:date="2026-07-29T11:09:00Z">
               <w:r>
                 <w:rPr>
                   <w:lang w:val="de-DE"/>
@@ -5026,88 +4636,32 @@
     <w:p>
       <w:pPr>
         <w:rPr>
-          <w:ins w:id="128" w:author="Martin von Berg" w:date="2026-07-29T11:09:00Z"/>
+          <w:ins w:id="139" w:author="Martin von Berg" w:date="2026-07-29T11:09:00Z"/>
           <w:lang w:val="de-DE"/>
         </w:rPr>
       </w:pPr>
-      <w:ins w:id="129" w:author="Martin von Berg" w:date="2026-07-29T11:09:00Z">
+      <w:ins w:id="140" w:author="Martin von Berg" w:date="2026-07-29T11:09:00Z">
         <w:r>
           <w:rPr>
             <w:lang w:val="de-DE"/>
           </w:rPr>
-          <w:t xml:space="preserve">Der Eintrag front ist bei einer statischen Startseite nicht nötig. Die Seite wird bereits aufgrund ihres tatsächlichen Post </w:t>
-        </w:r>
-        <w:proofErr w:type="spellStart"/>
-        <w:r>
-          <w:rPr>
-            <w:lang w:val="de-DE"/>
-          </w:rPr>
-          <w:t>Types</w:t>
-        </w:r>
-        <w:proofErr w:type="spellEnd"/>
-        <w:r>
-          <w:rPr>
-            <w:lang w:val="de-DE"/>
-          </w:rPr>
-          <w:t xml:space="preserve"> </w:t>
-        </w:r>
-        <w:proofErr w:type="spellStart"/>
-        <w:r>
-          <w:rPr>
-            <w:lang w:val="de-DE"/>
-          </w:rPr>
-          <w:t>page</w:t>
-        </w:r>
-        <w:proofErr w:type="spellEnd"/>
-        <w:r>
-          <w:rPr>
-            <w:lang w:val="de-DE"/>
-          </w:rPr>
-          <w:t xml:space="preserve"> verarbeitet.</w:t>
+          <w:t>Der Eintrag front ist bei einer statischen Startseite nicht nötig. Die Seite wird bereits aufgrund ihres tatsächlichen Post Types page verarbeitet.</w:t>
         </w:r>
       </w:ins>
     </w:p>
     <w:p>
       <w:pPr>
         <w:rPr>
-          <w:ins w:id="130" w:author="Martin von Berg" w:date="2026-07-29T11:09:00Z"/>
+          <w:ins w:id="141" w:author="Martin von Berg" w:date="2026-07-29T11:09:00Z"/>
           <w:lang w:val="de-DE"/>
         </w:rPr>
       </w:pPr>
-      <w:ins w:id="131" w:author="Martin von Berg" w:date="2026-07-29T11:09:00Z">
+      <w:ins w:id="142" w:author="Martin von Berg" w:date="2026-07-29T11:09:00Z">
         <w:r>
           <w:rPr>
             <w:lang w:val="de-DE"/>
           </w:rPr>
-          <w:t xml:space="preserve">Der Eintrag </w:t>
-        </w:r>
-        <w:proofErr w:type="spellStart"/>
-        <w:r>
-          <w:rPr>
-            <w:lang w:val="de-DE"/>
-          </w:rPr>
-          <w:t>home</w:t>
-        </w:r>
-        <w:proofErr w:type="spellEnd"/>
-        <w:r>
-          <w:rPr>
-            <w:lang w:val="de-DE"/>
-          </w:rPr>
-          <w:t xml:space="preserve"> bewirkt ebenfalls nichts. Der Beitragsindex wird zusätzlich durch </w:t>
-        </w:r>
-        <w:proofErr w:type="spellStart"/>
-        <w:r>
-          <w:rPr>
-            <w:lang w:val="de-DE"/>
-          </w:rPr>
-          <w:t>is_singular</w:t>
-        </w:r>
-        <w:proofErr w:type="spellEnd"/>
-        <w:r>
-          <w:rPr>
-            <w:lang w:val="de-DE"/>
-          </w:rPr>
-          <w:t>() ausgeschlossen.</w:t>
+          <w:t>Der Eintrag home bewirkt ebenfalls nichts. Der Beitragsindex wird zusätzlich durch is_singular() ausgeschlossen.</w:t>
         </w:r>
       </w:ins>
     </w:p>
@@ -5394,21 +4948,12 @@
       <w:pStyle w:val="Fuzeile"/>
       <w:jc w:val="right"/>
     </w:pPr>
-    <w:proofErr w:type="spellStart"/>
     <w:r>
       <w:rPr>
         <w:color w:val="6B7280"/>
         <w:sz w:val="18"/>
       </w:rPr>
-      <w:t>Seite</w:t>
-    </w:r>
-    <w:proofErr w:type="spellEnd"/>
-    <w:r>
-      <w:rPr>
-        <w:color w:val="6B7280"/>
-        <w:sz w:val="18"/>
-      </w:rPr>
-      <w:t xml:space="preserve"> </w:t>
+      <w:t xml:space="preserve">Seite </w:t>
     </w:r>
     <w:r>
       <w:rPr>
@@ -5482,31 +5027,13 @@
       <w:pStyle w:val="Kopfzeile"/>
       <w:jc w:val="right"/>
     </w:pPr>
-    <w:proofErr w:type="spellStart"/>
     <w:r>
       <w:rPr>
         <w:color w:val="6B7280"/>
         <w:sz w:val="17"/>
       </w:rPr>
-      <w:t>Technische</w:t>
+      <w:t>Technische Dokumentation  |  StripImageMetadata.php</w:t>
     </w:r>
-    <w:proofErr w:type="spellEnd"/>
-    <w:r>
-      <w:rPr>
-        <w:color w:val="6B7280"/>
-        <w:sz w:val="17"/>
-      </w:rPr>
-      <w:t xml:space="preserve"> Dokumentation  |  </w:t>
-    </w:r>
-    <w:proofErr w:type="spellStart"/>
-    <w:r>
-      <w:rPr>
-        <w:color w:val="6B7280"/>
-        <w:sz w:val="17"/>
-      </w:rPr>
-      <w:t>StripImageMetadata.php</w:t>
-    </w:r>
-    <w:proofErr w:type="spellEnd"/>
   </w:p>
 </w:hdr>
 </file>
@@ -6477,6 +6004,7 @@
   <w:style w:type="character" w:default="1" w:styleId="Absatz-Standardschriftart">
     <w:name w:val="Default Paragraph Font"/>
     <w:uiPriority w:val="1"/>
+    <w:semiHidden/>
     <w:unhideWhenUsed/>
   </w:style>
   <w:style w:type="table" w:default="1" w:styleId="NormaleTabelle">

</xml_diff>